<commit_message>
Report<->thesis alignment: cross-check + close two parity gaps
Diffed all shared load-bearing findings across both rendered docx: 10/10 align
(Qwen-1.7B XSTest borderline, human-val kappa 0.59/0.11, Llama -0.040 sole sig
decrease, INT8 cross-run-divergence wording, multiseed 0/5, 2nd-judge kappa
0.68-0.95, direct-request threat model, 339 tests) with no contradictions. The
report's Phi dOR=-0.028 is inside a dated changelog row headed "128-token era;
superseded" (correctly historical).

Closed two report-has-it/thesis-silent gaps for parity: added the human-vs-scorer
confusion counts (regex over-flagged 101 vs classifier's 18; human flagged 37,
highest bar) to thesis 6.1, and a self-continuation limitation bullet mirroring
report Ch8.

Gates: verify-claims 59/59, pytest 339, agent-check 8/8; automated cross-check
confirms both docs carry every shared claim.

Co-Authored-By: Claude Opus 4.8 <noreply@anthropic.com>
</commit_message>
<xml_diff>
--- a/docs/FYP_Thesis_2026-07-02_v4.docx
+++ b/docs/FYP_Thesis_2026-07-02_v4.docx
@@ -3904,7 +3904,7 @@
           <w:sz w:val="24"/>
           <w:szCs w:val="24"/>
         </w:rPr>
-        <w:t xml:space="preserve">The first result concerns the instrument. The refusal regex reports far higher Attack Success Rates than the HarmBench classifier, and the gap is uneven by family. Cohen’s κ between the regex and the classifier at the 512-token reference budget is poor for the Qwen and Mistral models and good for Llama and Phi (Table 6.1), because models that produce a large volume of ambiguous, non-refusing-but-benign text are exactly those the regex mis-scores. In aggregate the classifier’s harmful set is a near-strict subset of the regex’s (29 judge-only labels against 325 regex-only across the ten models), so the disagreement is overwhelmingly one-directional over-counting. At the retired 128-token budget, adopting the classifier had moved the significant increases wholesale: the regex placed them on Qwen3-4B and Mistral, the classifier on Qwen3-1.7B alone. At the reference budget it removes every significant increase entirely (§6.2). A stratified human-label audit (200 items, single annotator) confirms the direction against truth rather than against another model: the classifier agrees with a human annotator at Cohen's κ 0.59 (moderate) while the regex agrees at only 0.11 (negligible), so refusal-counting over-states harmful compliance relative to human judgment, not merely relative to the classifier — a better scorer, though at moderate agreement, not a perfect human proxy. In safety evaluation the choice of scorer is not a detail: it can change the conclusion.</w:t>
+        <w:t xml:space="preserve">The first result concerns the instrument. The refusal regex reports far higher Attack Success Rates than the HarmBench classifier, and the gap is uneven by family. Cohen’s κ between the regex and the classifier at the 512-token reference budget is poor for the Qwen and Mistral models and good for Llama and Phi (Table 6.1), because models that produce a large volume of ambiguous, non-refusing-but-benign text are exactly those the regex mis-scores. In aggregate the classifier’s harmful set is a near-strict subset of the regex’s (29 judge-only labels against 325 regex-only across the ten models), so the disagreement is overwhelmingly one-directional over-counting. At the retired 128-token budget, adopting the classifier had moved the significant increases wholesale: the regex placed them on Qwen3-4B and Mistral, the classifier on Qwen3-1.7B alone. At the reference budget it removes every significant increase entirely (§6.2). A stratified human-label audit (200 items, single annotator) confirms the direction against truth rather than against another model: the classifier agrees with a human annotator at Cohen's κ 0.59 (moderate) while the regex agrees at only 0.11 (negligible) — against the human's 200 labels the regex over-flagged 101 responses as harmful to the classifier's 18, and the human, flagging 37, applied the highest bar of the three — so refusal-counting over-states harmful compliance relative to human judgment, not merely relative to the classifier; the classifier is a better scorer, though at moderate agreement, not a perfect human proxy. In safety evaluation the choice of scorer is not a detail: it can change the conclusion.</w:t>
       </w:r>
     </w:p>
     <w:tbl>
@@ -6924,6 +6924,24 @@
           <w:szCs w:val="24"/>
         </w:rPr>
         <w:t xml:space="preserve">Generation budget: absolute ASR is budget-dependent by construction (complete generations give more room for harmful content to appear), which is controlled here by adopting HarmBench’s standardized 512-token budget; the 128-era signals are budget artefacts retained only as the generation-length comparison (Qwen3-1.7B NF4 +0.055 via truncation; Llama-3B INT8 +0.040 via cross-run greedy divergence, since Llama truncates at only 3–4 percent).</w:t>
+      </w:r>
+    </w:p>
+    <w:p>
+      <w:pPr>
+        <w:pStyle w:val="ListParagraph"/>
+        <w:numPr>
+          <w:ilvl w:val="0"/>
+          <w:numId w:val="3"/>
+        </w:numPr>
+        <w:spacing w:after="80" w:line="276"/>
+      </w:pPr>
+      <w:r>
+        <w:rPr>
+          <w:rFonts w:ascii="Times New Roman" w:cs="Times New Roman" w:eastAsia="Times New Roman" w:hAnsi="Times New Roman"/>
+          <w:sz w:val="24"/>
+          <w:szCs w:val="24"/>
+        </w:rPr>
+        <w:t xml:space="preserve">Generation stopping: the generation loop halts only on the tokenizer's default end-of-sequence token, so responses can run past the model's completed answer into synthetic follow-up turns (the model role-playing both sides of a dialogue), which skip_special_tokens decoding saves as a run-on. This is a decoding-configuration artefact: it inflates response length but is produced identically by both pair members, so it cancels in every matched-pair delta, and the full-response classifier still scores any harmful content a continuation might contain. Stopping at the chat turn-end token is a straightforward fix for future runs.</w:t>
       </w:r>
     </w:p>
     <w:p>

</xml_diff>